<commit_message>
Add requirements prioritization summary
</commit_message>
<xml_diff>
--- a/report/02_Requirements_and_New_Venture.docx
+++ b/report/02_Requirements_and_New_Venture.docx
@@ -3,8 +3,124 @@
 <w:document xmlns:ve="http://schemas.openxmlformats.org/markup-compatibility/2006" xmlns:o="urn:schemas-microsoft-com:office:office" xmlns:r="http://schemas.openxmlformats.org/officeDocument/2006/relationships" xmlns:m="http://schemas.openxmlformats.org/officeDocument/2006/math" xmlns:v="urn:schemas-microsoft-com:vml" xmlns:wp="http://schemas.openxmlformats.org/drawingml/2006/wordprocessingDrawing" xmlns:w10="urn:schemas-microsoft-com:office:word" xmlns:w="http://schemas.openxmlformats.org/wordprocessingml/2006/main" xmlns:wne="http://schemas.microsoft.com/office/word/2006/wordml">
   <w:body>
     <w:p>
-      <w:r>
-        <w:t>Prioritized Requirements; New Venture Proposal</w:t>
+      <w:pPr>
+        <w:pStyle w:val="Heading1"/>
+      </w:pPr>
+      <w:r>
+        <w:t>Prioritized Requirements</w:t>
+      </w:r>
+    </w:p>
+    <w:p>
+      <w:pPr>
+        <w:pStyle w:val="Heading2"/>
+      </w:pPr>
+      <w:r>
+        <w:t>Requirements Approach</w:t>
+      </w:r>
+    </w:p>
+    <w:p>
+      <w:r>
+        <w:t>The project requirements were prioritized according to their role in supporting the customer-facing Domino’s online-ordering process. High-priority requirements cover the minimum capabilities needed to select a store, configure products, submit an order, record payment, and track fulfillment. Medium-priority requirements extend the model with promotions, loyalty, historical reporting, and related analysis. The proposed subscription venture is classified separately because it represents a new service rather than a required capability of the current ordering process.</w:t>
+      </w:r>
+    </w:p>
+    <w:p>
+      <w:r>
+        <w:rPr>
+          <w:noProof/>
+        </w:rPr>
+        <w:drawing>
+          <wp:inline distT="0" distB="0" distL="0" distR="0">
+            <wp:extent cx="5316220" cy="956945"/>
+            <wp:effectExtent l="19050" t="0" r="0" b="0"/>
+            <wp:docPr id="1" name="Picture 1"/>
+            <wp:cNvGraphicFramePr>
+              <a:graphicFrameLocks xmlns:a="http://schemas.openxmlformats.org/drawingml/2006/main" noChangeAspect="1"/>
+            </wp:cNvGraphicFramePr>
+            <a:graphic xmlns:a="http://schemas.openxmlformats.org/drawingml/2006/main">
+              <a:graphicData uri="http://schemas.openxmlformats.org/drawingml/2006/picture">
+                <pic:pic xmlns:pic="http://schemas.openxmlformats.org/drawingml/2006/picture">
+                  <pic:nvPicPr>
+                    <pic:cNvPr id="0" name="Picture 1"/>
+                    <pic:cNvPicPr>
+                      <a:picLocks noChangeAspect="1" noChangeArrowheads="1"/>
+                    </pic:cNvPicPr>
+                  </pic:nvPicPr>
+                  <pic:blipFill>
+                    <a:blip r:embed="rId4"/>
+                    <a:srcRect/>
+                    <a:stretch>
+                      <a:fillRect/>
+                    </a:stretch>
+                  </pic:blipFill>
+                  <pic:spPr bwMode="auto">
+                    <a:xfrm>
+                      <a:off x="0" y="0"/>
+                      <a:ext cx="5316220" cy="956945"/>
+                    </a:xfrm>
+                    <a:prstGeom prst="rect">
+                      <a:avLst/>
+                    </a:prstGeom>
+                    <a:noFill/>
+                    <a:ln w="9525">
+                      <a:noFill/>
+                      <a:miter lim="800000"/>
+                      <a:headEnd/>
+                      <a:tailEnd/>
+                    </a:ln>
+                  </pic:spPr>
+                </pic:pic>
+              </a:graphicData>
+            </a:graphic>
+          </wp:inline>
+        </w:drawing>
+      </w:r>
+    </w:p>
+    <w:p>
+      <w:pPr>
+        <w:pStyle w:val="Heading2"/>
+      </w:pPr>
+      <w:r>
+        <w:t>Priority Summary</w:t>
+      </w:r>
+    </w:p>
+    <w:p>
+      <w:pPr>
+        <w:pStyle w:val="Heading2"/>
+      </w:pPr>
+      <w:r>
+        <w:t>Implementation Status Summary</w:t>
+      </w:r>
+    </w:p>
+    <w:p>
+      <w:pPr>
+        <w:pStyle w:val="Heading1"/>
+      </w:pPr>
+      <w:r>
+        <w:t xml:space="preserve"> New Venture Proposal</w:t>
+      </w:r>
+    </w:p>
+    <w:p>
+      <w:pPr>
+        <w:pStyle w:val="Heading2"/>
+      </w:pPr>
+      <w:r>
+        <w:t>Proposal Overview</w:t>
+      </w:r>
+    </w:p>
+    <w:p>
+      <w:pPr>
+        <w:pStyle w:val="Heading2"/>
+      </w:pPr>
+      <w:r>
+        <w:t>Customer Experience and Business Value</w:t>
+      </w:r>
+    </w:p>
+    <w:p>
+      <w:pPr>
+        <w:pStyle w:val="Heading2"/>
+      </w:pPr>
+      <w:r>
+        <w:t>Database Impact</w:t>
       </w:r>
     </w:p>
     <w:sectPr>
@@ -178,6 +294,53 @@
     <w:qFormat/>
     <w:rsid w:val="00CF7D49"/>
   </w:style>
+  <w:style w:type="paragraph" w:styleId="Heading1">
+    <w:name w:val="heading 1"/>
+    <w:basedOn w:val="Normal"/>
+    <w:next w:val="Normal"/>
+    <w:link w:val="Heading1Char"/>
+    <w:uiPriority w:val="9"/>
+    <w:qFormat/>
+    <w:rsid w:val="00AB4271"/>
+    <w:pPr>
+      <w:keepNext/>
+      <w:keepLines/>
+      <w:spacing w:before="480" w:after="0"/>
+      <w:outlineLvl w:val="0"/>
+    </w:pPr>
+    <w:rPr>
+      <w:rFonts w:asciiTheme="majorHAnsi" w:eastAsiaTheme="majorEastAsia" w:hAnsiTheme="majorHAnsi" w:cstheme="majorBidi"/>
+      <w:b/>
+      <w:bCs/>
+      <w:color w:val="365F91" w:themeColor="accent1" w:themeShade="BF"/>
+      <w:sz w:val="28"/>
+      <w:szCs w:val="28"/>
+    </w:rPr>
+  </w:style>
+  <w:style w:type="paragraph" w:styleId="Heading2">
+    <w:name w:val="heading 2"/>
+    <w:basedOn w:val="Normal"/>
+    <w:next w:val="Normal"/>
+    <w:link w:val="Heading2Char"/>
+    <w:uiPriority w:val="9"/>
+    <w:unhideWhenUsed/>
+    <w:qFormat/>
+    <w:rsid w:val="00AB4271"/>
+    <w:pPr>
+      <w:keepNext/>
+      <w:keepLines/>
+      <w:spacing w:before="200" w:after="0"/>
+      <w:outlineLvl w:val="1"/>
+    </w:pPr>
+    <w:rPr>
+      <w:rFonts w:asciiTheme="majorHAnsi" w:eastAsiaTheme="majorEastAsia" w:hAnsiTheme="majorHAnsi" w:cstheme="majorBidi"/>
+      <w:b/>
+      <w:bCs/>
+      <w:color w:val="4F81BD" w:themeColor="accent1"/>
+      <w:sz w:val="26"/>
+      <w:szCs w:val="26"/>
+    </w:rPr>
+  </w:style>
   <w:style w:type="character" w:default="1" w:styleId="DefaultParagraphFont">
     <w:name w:val="Default Paragraph Font"/>
     <w:uiPriority w:val="1"/>
@@ -205,6 +368,66 @@
     <w:uiPriority w:val="99"/>
     <w:semiHidden/>
     <w:unhideWhenUsed/>
+  </w:style>
+  <w:style w:type="character" w:customStyle="1" w:styleId="Heading1Char">
+    <w:name w:val="Heading 1 Char"/>
+    <w:basedOn w:val="DefaultParagraphFont"/>
+    <w:link w:val="Heading1"/>
+    <w:uiPriority w:val="9"/>
+    <w:rsid w:val="00AB4271"/>
+    <w:rPr>
+      <w:rFonts w:asciiTheme="majorHAnsi" w:eastAsiaTheme="majorEastAsia" w:hAnsiTheme="majorHAnsi" w:cstheme="majorBidi"/>
+      <w:b/>
+      <w:bCs/>
+      <w:color w:val="365F91" w:themeColor="accent1" w:themeShade="BF"/>
+      <w:sz w:val="28"/>
+      <w:szCs w:val="28"/>
+    </w:rPr>
+  </w:style>
+  <w:style w:type="character" w:customStyle="1" w:styleId="Heading2Char">
+    <w:name w:val="Heading 2 Char"/>
+    <w:basedOn w:val="DefaultParagraphFont"/>
+    <w:link w:val="Heading2"/>
+    <w:uiPriority w:val="9"/>
+    <w:rsid w:val="00AB4271"/>
+    <w:rPr>
+      <w:rFonts w:asciiTheme="majorHAnsi" w:eastAsiaTheme="majorEastAsia" w:hAnsiTheme="majorHAnsi" w:cstheme="majorBidi"/>
+      <w:b/>
+      <w:bCs/>
+      <w:color w:val="4F81BD" w:themeColor="accent1"/>
+      <w:sz w:val="26"/>
+      <w:szCs w:val="26"/>
+    </w:rPr>
+  </w:style>
+  <w:style w:type="paragraph" w:styleId="BalloonText">
+    <w:name w:val="Balloon Text"/>
+    <w:basedOn w:val="Normal"/>
+    <w:link w:val="BalloonTextChar"/>
+    <w:uiPriority w:val="99"/>
+    <w:semiHidden/>
+    <w:unhideWhenUsed/>
+    <w:rsid w:val="00AB4271"/>
+    <w:pPr>
+      <w:spacing w:after="0" w:line="240" w:lineRule="auto"/>
+    </w:pPr>
+    <w:rPr>
+      <w:rFonts w:ascii="Tahoma" w:hAnsi="Tahoma" w:cs="Tahoma"/>
+      <w:sz w:val="16"/>
+      <w:szCs w:val="16"/>
+    </w:rPr>
+  </w:style>
+  <w:style w:type="character" w:customStyle="1" w:styleId="BalloonTextChar">
+    <w:name w:val="Balloon Text Char"/>
+    <w:basedOn w:val="DefaultParagraphFont"/>
+    <w:link w:val="BalloonText"/>
+    <w:uiPriority w:val="99"/>
+    <w:semiHidden/>
+    <w:rsid w:val="00AB4271"/>
+    <w:rPr>
+      <w:rFonts w:ascii="Tahoma" w:hAnsi="Tahoma" w:cs="Tahoma"/>
+      <w:sz w:val="16"/>
+      <w:szCs w:val="16"/>
+    </w:rPr>
   </w:style>
 </w:styles>
 </file>

</xml_diff>

<commit_message>
Separate requirements priorities from final review
</commit_message>
<xml_diff>
--- a/report/02_Requirements_and_New_Venture.docx
+++ b/report/02_Requirements_and_New_Venture.docx
@@ -90,28 +90,33 @@
     </w:p>
     <w:p>
       <w:pPr>
+        <w:pStyle w:val="Heading1"/>
+      </w:pPr>
+      <w:r>
+        <w:t>New Venture Proposal</w:t>
+      </w:r>
+    </w:p>
+    <w:p>
+      <w:pPr>
         <w:pStyle w:val="Heading2"/>
       </w:pPr>
       <w:r>
-        <w:t>Implementation Status Summary</w:t>
-      </w:r>
-    </w:p>
-    <w:p>
-      <w:r>
-        <w:t>All 18 documented requirements are complete in Version 1.3. High-priority requirements are supported by the customer, menu, order, payment, and order-status portions of the model.</w:t>
-      </w:r>
-    </w:p>
-    <w:p>
-      <w:r>
-        <w:t>Medium-priority requirements are supported by promotions, loyalty accounts, order history, and reporting queries. Meal Club is supported by subscription plans, customer subscriptions, and subscription-benefit events. Appendix A provides the detailed requirement status and supporting evidence.</w:t>
-      </w:r>
-    </w:p>
-    <w:p>
-      <w:pPr>
-        <w:pStyle w:val="Heading1"/>
-      </w:pPr>
-      <w:r>
-        <w:t xml:space="preserve"> New Venture Proposal</w:t>
+        <w:t>Proposal Overview</w:t>
+      </w:r>
+    </w:p>
+    <w:p>
+      <w:r>
+        <w:t>Domino’s Meal Club is a proposed monthly subscription service for registered customers. Each plan provides a fixed credit for eligible orders. Each plan also has a monthly usage limit.</w:t>
+      </w:r>
+    </w:p>
+    <w:p>
+      <w:r>
+        <w:t>The service is intended to encourage repeat ordering by giving customers a predictable benefit in exchange for a membership fee. Members can select a plan, maintain an active subscription, or cancel the service. When an eligible order uses a credit, the database records the benefit.</w:t>
+      </w:r>
+    </w:p>
+    <w:p>
+      <w:r>
+        <w:t>This project models the subscription relationship and benefit use. It does not model recurring billing or profitability calculations.</w:t>
       </w:r>
     </w:p>
     <w:p>
@@ -119,22 +124,17 @@
         <w:pStyle w:val="Heading2"/>
       </w:pPr>
       <w:r>
-        <w:t>Proposal Overview</w:t>
-      </w:r>
-    </w:p>
-    <w:p>
-      <w:r>
-        <w:t>Domino’s Meal Club is a proposed monthly subscription service for registered customers. Each plan provides a fixed credit for eligible orders. Each plan also has a monthly usage limit.</w:t>
-      </w:r>
-    </w:p>
-    <w:p>
-      <w:r>
-        <w:t>The service is intended to encourage repeat ordering by giving customers a predictable benefit in exchange for a membership fee. Members can select a plan, maintain an active subscription, or cancel the service. When an eligible order uses a credit, the database records the benefit.</w:t>
-      </w:r>
-    </w:p>
-    <w:p>
-      <w:r>
-        <w:t>This project models the subscription relationship and benefit use. It does not model recurring billing or profitability calculations.</w:t>
+        <w:t>Customer Experience and Business Value</w:t>
+      </w:r>
+    </w:p>
+    <w:p>
+      <w:r>
+        <w:t>Customers would enroll in a Meal Club plan through their account. They would receive a benefit when placing an eligible order.</w:t>
+      </w:r>
+    </w:p>
+    <w:p>
+      <w:r>
+        <w:t>The service gives frequent customers a reason to remain engaged with the ordering platform. It also creates a predictable membership relationship for the business. The design supports analysis of enrollment, cancellations, plan selection, credit use, and benefits applied to orders.</w:t>
       </w:r>
     </w:p>
     <w:p>
@@ -142,35 +142,17 @@
         <w:pStyle w:val="Heading2"/>
       </w:pPr>
       <w:r>
+        <w:t>Database Impact</w:t>
+      </w:r>
+    </w:p>
+    <w:p>
+      <w:r>
+        <w:t>The proposal adds three entities to the ordering model: SUBSCRIPTION_PLAN, CUSTOMER_SUBSCRIPTION, and SUBSCRIPTION_BENEFIT_EVENT.</w:t>
+      </w:r>
+    </w:p>
+    <w:p>
+      <w:r>
         <w:lastRenderedPageBreak/>
-        <w:t>Customer Experience and Business Value</w:t>
-      </w:r>
-    </w:p>
-    <w:p>
-      <w:r>
-        <w:t>Customers would enroll in a Meal Club plan through their account. They would receive a benefit when placing an eligible order.</w:t>
-      </w:r>
-    </w:p>
-    <w:p>
-      <w:r>
-        <w:t>The service gives frequent customers a reason to remain engaged with the ordering platform. It also creates a predictable membership relationship for the business. The design supports analysis of enrollment, cancellations, plan selection, credit use, and benefits applied to orders.</w:t>
-      </w:r>
-    </w:p>
-    <w:p>
-      <w:pPr>
-        <w:pStyle w:val="Heading2"/>
-      </w:pPr>
-      <w:r>
-        <w:t>Database Impact</w:t>
-      </w:r>
-    </w:p>
-    <w:p>
-      <w:r>
-        <w:t>The proposal adds three entities to the ordering model: SUBSCRIPTION_PLAN, CUSTOMER_SUBSCRIPTION, and SUBSCRIPTION_BENEFIT_EVENT.</w:t>
-      </w:r>
-    </w:p>
-    <w:p>
-      <w:r>
         <w:t>SUBSCRIPTION_PLAN defines the membership options, benefit amount, and monthly usage limit. CUSTOMER_SUBSCRIPTION links a customer to a plan. It records the subscription status and relevant dates.</w:t>
       </w:r>
     </w:p>

</xml_diff>

<commit_message>
Add appendix for business requirements
</commit_message>
<xml_diff>
--- a/report/02_Requirements_and_New_Venture.docx
+++ b/report/02_Requirements_and_New_Venture.docx
@@ -26,6 +26,11 @@
     <w:p>
       <w:r>
         <w:t>Medium-priority requirements cover promotions, loyalty, historical reporting, and analysis. Meal Club is classified separately because it is a proposed new service, not a required part of the current ordering process.</w:t>
+      </w:r>
+    </w:p>
+    <w:p>
+      <w:r>
+        <w:t>Each requirement has a unique BR identifier used throughout this report. The complete business requirements register, including the requirement descriptions and priorities, is provided in Appendix B.</w:t>
       </w:r>
     </w:p>
     <w:p>
@@ -142,6 +147,7 @@
         <w:pStyle w:val="Heading2"/>
       </w:pPr>
       <w:r>
+        <w:lastRenderedPageBreak/>
         <w:t>Database Impact</w:t>
       </w:r>
     </w:p>
@@ -152,7 +158,6 @@
     </w:p>
     <w:p>
       <w:r>
-        <w:lastRenderedPageBreak/>
         <w:t>SUBSCRIPTION_PLAN defines the membership options, benefit amount, and monthly usage limit. CUSTOMER_SUBSCRIPTION links a customer to a plan. It records the subscription status and relevant dates.</w:t>
       </w:r>
     </w:p>

</xml_diff>